<commit_message>
Switch live demo URL to http://114.215.209.144:8088
Update docs, integration API copy, deploy scripts, and IP:8088 nginx path for pre-ICP demo access.

Co-authored-by: Cursor <cursoragent@cursor.com>
</commit_message>
<xml_diff>
--- a/作品报告_AgentShield.docx
+++ b/作品报告_AgentShield.docx
@@ -249,7 +249,7 @@
           <w:b w:val="0"/>
           <w:sz w:val="24"/>
         </w:rPr>
-        <w:t>本作品 AgentShield 是一款面向大模型智能体工具调用的安全防护网关。系统以“行为级安全”为核心理念，在 Agent 规划层与沙箱工具之间插入统一安全网关，对每一次工具调用进行角色权限校验、参数规则检测、语义意图识别、工具返回内容二次审查及全链路审计，并输出 allow / mask / confirm / block 四层决策。系统支持校园、个人助手、企业客服三套即插即用策略包，可通过 HTTP API、Python 装饰器、LangChain、MCP 等方式接入主流 Agent 框架，并支持 Cursor、Claude Desktop、Trae 等 IDE 通过 MCP 挂载受保护工具，以及 Claude API、OpenAI Codex 在 tool calling 循环中调用 evaluate 接口，并可在无外部 API 密钥条件下离线完整演示。作品已部署上线演示站点（https://agentshieldtop.xyz），并在 GitHub 开源（https://github.com/kkangtai9607/agentShield），便于评委在线体验与开发者二次集成。</w:t>
+        <w:t>本作品 AgentShield 是一款面向大模型智能体工具调用的安全防护网关。系统以“行为级安全”为核心理念，在 Agent 规划层与沙箱工具之间插入统一安全网关，对每一次工具调用进行角色权限校验、参数规则检测、语义意图识别、工具返回内容二次审查及全链路审计，并输出 allow / mask / confirm / block 四层决策。系统支持校园、个人助手、企业客服三套即插即用策略包，可通过 HTTP API、Python 装饰器、LangChain、MCP 等方式接入主流 Agent 框架，并支持 Cursor、Claude Desktop、Trae 等 IDE 通过 MCP 挂载受保护工具，以及 Claude API、OpenAI Codex 在 tool calling 循环中调用 evaluate 接口，并可在无外部 API 密钥条件下离线完整演示。作品已部署上线演示站点（http://114.215.209.144:8088），并在 GitHub 开源（https://github.com/kkangtai9607/agentShield），便于评委在线体验与开发者二次集成。</w:t>
       </w:r>
     </w:p>
     <w:p>
@@ -447,7 +447,7 @@
           <w:b w:val="0"/>
           <w:sz w:val="24"/>
         </w:rPr>
-        <w:t>已上线演示：https://agentshieldtop.xyz，评委零配置访问「快速集成 → 在线试集成」。</w:t>
+        <w:t>已上线演示：http://114.215.209.144:8088，评委零配置访问「快速集成 → 在线试集成」。</w:t>
       </w:r>
     </w:p>
     <w:p>
@@ -488,7 +488,7 @@
           <w:b w:val="0"/>
           <w:sz w:val="24"/>
         </w:rPr>
-        <w:t>AgentShield 可部署于教育科研平台的教学 Agent、个人知识助手、企业客服/工单 Agent、低代码 Agent 平台等场景。用户通过 POLICY_FILE 配置自有角色与工具权限即可落地，适用于对数据外发、命令执行、数据库查询有合规要求的行业环境。当前已通过阿里云轻量服务器完成生产部署，演示地址 https://agentshieldtop.xyz，源码托管于 https://github.com/kkangtai9607/agentShield。</w:t>
+        <w:t>AgentShield 可部署于教育科研平台的教学 Agent、个人知识助手、企业客服/工单 Agent、低代码 Agent 平台等场景。用户通过 POLICY_FILE 配置自有角色与工具权限即可落地，适用于对数据外发、命令执行、数据库查询有合规要求的行业环境。当前已通过阿里云轻量服务器完成生产部署，演示地址 http://114.215.209.144:8088，源码托管于 https://github.com/kkangtai9607/agentShield。</w:t>
       </w:r>
     </w:p>
     <w:p>
@@ -824,7 +824,7 @@
           <w:b w:val="0"/>
           <w:sz w:val="24"/>
         </w:rPr>
-        <w:t>框架演示 / 快速集成：LangChain、MCP 演示；主流 Agent 接入（Cursor、Claude、Trae、Codex）文档与在线试集成；开源仓库（https://github.com/kkangtai9607/agentShield）与演示站（https://agentshieldtop.xyz）。</w:t>
+        <w:t>框架演示 / 快速集成：LangChain、MCP 演示；主流 Agent 接入（Cursor、Claude、Trae、Codex）文档与在线试集成；开源仓库（https://github.com/kkangtai9607/agentShield）与演示站（http://114.215.209.144:8088）。</w:t>
       </w:r>
     </w:p>
     <w:p>
@@ -921,7 +921,7 @@
           <w:b w:val="0"/>
           <w:sz w:val="24"/>
         </w:rPr>
-        <w:t>生产部署：nginx + systemd，域名 https://agentshieldtop.xyz，后端 127.0.0.1:8001 仅本机反代。</w:t>
+        <w:t>生产部署：nginx + systemd，演示地址 http://114.215.209.144:8088，后端 127.0.0.1:8001 仅本机反代。</w:t>
       </w:r>
     </w:p>
     <w:p>
@@ -981,7 +981,7 @@
           <w:b w:val="0"/>
           <w:sz w:val="24"/>
         </w:rPr>
-        <w:t>测试分为四个层次：（1）单元测试：策略引擎、规范化、语义相似度、JWT 鉴权；（2）场景测试：四内置攻击剧本端到端阻断；（3）Benchmark 测试：22 条标注样本（normal/attack/bypass）自动跑分；（4）人工演示测试：三场景策略包切换、人工 confirm 闭环、LangChain/MCP 接入演示；（5）线上验收：https://agentshieldtop.xyz 健康检查、登录、快速集成与攻击剧本演示。</w:t>
+        <w:t>测试分为四个层次：（1）单元测试：策略引擎、规范化、语义相似度、JWT 鉴权；（2）场景测试：四内置攻击剧本端到端阻断；（3）Benchmark 测试：22 条标注样本（normal/attack/bypass）自动跑分；（4）人工演示测试：三场景策略包切换、人工 confirm 闭环、LangChain/MCP 接入演示；（5）线上验收：http://114.215.209.144:8088 健康检查、登录、快速集成与攻击剧本演示。</w:t>
       </w:r>
     </w:p>
     <w:p>
@@ -1036,7 +1036,7 @@
           <w:b w:val="0"/>
           <w:sz w:val="24"/>
         </w:rPr>
-        <w:t>线上环境：阿里云轻量服务器，HTTPS 站点 https://agentshieldtop.xyz，nginx 反代 + Let's Encrypt。</w:t>
+        <w:t>线上环境：阿里云轻量服务器，演示入口 http://114.215.209.144:8088（nginx :8088 反代 + 后端 127.0.0.1:8001）。</w:t>
       </w:r>
     </w:p>
     <w:p>
@@ -1571,7 +1571,7 @@
           <w:b w:val="0"/>
           <w:sz w:val="24"/>
         </w:rPr>
-        <w:t>提供 HTTP evaluate、Python 装饰器、LangChain StructuredTool、MCP stdio 四种接入路径，并编写 INTEGRATION-AGENTS.md 指导 Cursor、Claude Desktop、Trae 通过 MCP 配置受保护工具，以及 Claude API、OpenAI Codex 在 tool_use / tool_calls 循环中调用安全网关，不绑定单一 Agent 框架，降低用户迁移成本，体现“安全网关”而非“演示 Demo”的工程定位。作品已开源（https://github.com/kkangtai9607/agentShield）并上线演示站（https://agentshieldtop.xyz），评委可在线体验，开发者可 clone 后嵌入集成。</w:t>
+        <w:t>提供 HTTP evaluate、Python 装饰器、LangChain StructuredTool、MCP stdio 四种接入路径，并编写 INTEGRATION-AGENTS.md 指导 Cursor、Claude Desktop、Trae 通过 MCP 配置受保护工具，以及 Claude API、OpenAI Codex 在 tool_use / tool_calls 循环中调用安全网关，不绑定单一 Agent 框架，降低用户迁移成本，体现“安全网关”而非“演示 Demo”的工程定位。作品已开源（https://github.com/kkangtai9607/agentShield）并上线演示站（http://114.215.209.144:8088），评委可在线体验，开发者可 clone 后嵌入集成。</w:t>
       </w:r>
     </w:p>
     <w:p>
@@ -1604,7 +1604,7 @@
           <w:b w:val="0"/>
           <w:sz w:val="24"/>
         </w:rPr>
-        <w:t>本作品针对大模型 Agent 工具调用场景的安全空白，设计并实现了 AgentShield 安全防护网关。系统以行为级拦截为核心，融合 RBAC 策略引擎、规范化防绕过、本地语义意图检测、工具返回 Content Guard、JWT 鉴权与全链路审计，并提供四层决策与人工确认闭环。三套场景策略包与多种集成方式使系统兼具竞赛演示表现力与工程落地潜力。作品已完成云端部署（https://agentshieldtop.xyz）与 GitHub 开源（https://github.com/kkangtai9607/agentShield），形成“在线体验 + 源码复现 + 嵌入集成 + 主流 Agent MCP/HTTP 接入”的完整交付形态。</w:t>
+        <w:t>本作品针对大模型 Agent 工具调用场景的安全空白，设计并实现了 AgentShield 安全防护网关。系统以行为级拦截为核心，融合 RBAC 策略引擎、规范化防绕过、本地语义意图检测、工具返回 Content Guard、JWT 鉴权与全链路审计，并提供四层决策与人工确认闭环。三套场景策略包与多种集成方式使系统兼具竞赛演示表现力与工程落地潜力。作品已完成云端部署（http://114.215.209.144:8088）与 GitHub 开源（https://github.com/kkangtai9607/agentShield），形成“在线体验 + 源码复现 + 嵌入集成 + 主流 Agent MCP/HTTP 接入”的完整交付形态。</w:t>
       </w:r>
     </w:p>
     <w:p>

</xml_diff>